<commit_message>
Record final IPFS publication and report evidence
</commit_message>
<xml_diff>
--- a/Assignment_Lab2/Report/Assignment_Lab2.docx
+++ b/Assignment_Lab2/Report/Assignment_Lab2.docx
@@ -1036,6 +1036,11 @@
       </w:r>
     </w:p>
     <w:p>
+      <w:r>
+        <w:t>Verified public evidence: the live contract is 0xCBa5edaAf9d6407A85531091C3762Ae6bfCF30c3 on Ethereum Sepolia (chain ID 11155111). The deployment transaction is 0xeee0ecc55a8dd03507e96afe978fcf0f50c8be8f7b1a3a32f7871e67b1b0b000 and one successful 0.001 test-ETH bet is 0xddbdda9cdbb081ced423dd02e8014acf18e541eafdedb528900ba9fcd4c7dc42. The public build is pinned at CID bafybeicmwmi6imwpgtf63sbvpoeb7dqa7onrrxtldfmjkpx6orqzv62n5y and was loaded through https://bafybeicmwmi6imwpgtf63sbvpoeb7dqa7onrrxtldfmjkpx6orqzv62n5y.ipfs.dweb.link/. The repository is public at https://github.com/p8zvvckk5s-jpg/ethereum-course-assignments. The frontend now normalizes a valid address even if a gateway or copy introduces incorrect checksum capitalization; this prevents a connected wallet from appearing successful while contract statistics remain blank.</w:t>
+      </w:r>
+    </w:p>
+    <w:p>
       <w:pPr>
         <w:pStyle w:val="FixedSection"/>
         <w:pageBreakBefore/>
@@ -1054,7 +1059,7 @@
     </w:p>
     <w:p>
       <w:r>
-        <w:t>The automated run recorded 21 passing checks on an isolated Ganache EVM with chain ID 31337. Compiler: 0.4.24+commit.e67f0147.Emscripten.clang. Run timestamp: 2026-09-30T13:58:50.114Z. Both the live-library build and the local-mock build compiled successfully.</w:t>
+        <w:t>The automated run recorded 21 passing checks on an isolated Ganache EVM with chain ID 31337. Compiler: 0.4.24+commit.e67f0147.Emscripten.clang. Run timestamp: 2026-10-03T10:25:30.239Z. Both the live-library build and the local-mock build compiled successfully.</w:t>
       </w:r>
     </w:p>
     <w:p>
@@ -1343,7 +1348,7 @@
               <w:rPr>
                 <w:sz w:val="20"/>
               </w:rPr>
-              <w:t>Sepolia deployment and real oracle callback</w:t>
+              <w:t>Sepolia deployment and one live interaction</w:t>
             </w:r>
           </w:p>
         </w:tc>
@@ -1365,7 +1370,53 @@
               <w:rPr>
                 <w:sz w:val="20"/>
               </w:rPr>
-              <w:t>Not recorded; wallet authorization and live validation remain</w:t>
+              <w:t>Completed; contract, deployment transaction and bet transaction recorded above</w:t>
+            </w:r>
+          </w:p>
+        </w:tc>
+      </w:tr>
+      <w:tr>
+        <w:tc>
+          <w:tcPr>
+            <w:tcW w:type="dxa" w:w="4464"/>
+            <w:tcMar>
+              <w:top w:w="85" w:type="dxa"/>
+              <w:left w:w="85" w:type="dxa"/>
+              <w:bottom w:w="85" w:type="dxa"/>
+              <w:right w:w="85" w:type="dxa"/>
+            </w:tcMar>
+          </w:tcPr>
+          <w:p>
+            <w:pPr>
+              <w:spacing w:after="40"/>
+            </w:pPr>
+            <w:r>
+              <w:rPr>
+                <w:sz w:val="20"/>
+              </w:rPr>
+              <w:t>Genuine oracle callback and 100-bet public round</w:t>
+            </w:r>
+          </w:p>
+        </w:tc>
+        <w:tc>
+          <w:tcPr>
+            <w:tcW w:type="dxa" w:w="5328"/>
+            <w:tcMar>
+              <w:top w:w="85" w:type="dxa"/>
+              <w:left w:w="85" w:type="dxa"/>
+              <w:bottom w:w="85" w:type="dxa"/>
+              <w:right w:w="85" w:type="dxa"/>
+            </w:tcMar>
+          </w:tcPr>
+          <w:p>
+            <w:pPr>
+              <w:spacing w:after="40"/>
+            </w:pPr>
+            <w:r>
+              <w:rPr>
+                <w:sz w:val="20"/>
+              </w:rPr>
+              <w:t>Not claimed; this requires 100 distinct participant addresses and live oracle availability</w:t>
             </w:r>
           </w:p>
         </w:tc>
@@ -1411,7 +1462,7 @@
               <w:rPr>
                 <w:sz w:val="20"/>
               </w:rPr>
-              <w:t>Not recorded; course repository and collaborator accounts remain</w:t>
+              <w:t>Completed; https://github.com/p8zvvckk5s-jpg/ethereum-course-assignments</w:t>
             </w:r>
           </w:p>
         </w:tc>
@@ -1435,7 +1486,7 @@
               <w:rPr>
                 <w:sz w:val="20"/>
               </w:rPr>
-              <w:t>IPFS publication and custom domain</w:t>
+              <w:t>IPFS publication</w:t>
             </w:r>
           </w:p>
         </w:tc>
@@ -1457,7 +1508,53 @@
               <w:rPr>
                 <w:sz w:val="20"/>
               </w:rPr>
-              <w:t>Not recorded; final deployed configuration and hosting access remain</w:t>
+              <w:t>Completed; CID bafybeicmwmi6imwpgtf63sbvpoeb7dqa7onrrxtldfmjkpx6orqzv62n5y and gateway https://bafybeicmwmi6imwpgtf63sbvpoeb7dqa7onrrxtldfmjkpx6orqzv62n5y.ipfs.dweb.link/</w:t>
+            </w:r>
+          </w:p>
+        </w:tc>
+      </w:tr>
+      <w:tr>
+        <w:tc>
+          <w:tcPr>
+            <w:tcW w:type="dxa" w:w="4464"/>
+            <w:tcMar>
+              <w:top w:w="85" w:type="dxa"/>
+              <w:left w:w="85" w:type="dxa"/>
+              <w:bottom w:w="85" w:type="dxa"/>
+              <w:right w:w="85" w:type="dxa"/>
+            </w:tcMar>
+          </w:tcPr>
+          <w:p>
+            <w:pPr>
+              <w:spacing w:after="40"/>
+            </w:pPr>
+            <w:r>
+              <w:rPr>
+                <w:sz w:val="20"/>
+              </w:rPr>
+              <w:t>Custom domain / DNSLink</w:t>
+            </w:r>
+          </w:p>
+        </w:tc>
+        <w:tc>
+          <w:tcPr>
+            <w:tcW w:type="dxa" w:w="5328"/>
+            <w:tcMar>
+              <w:top w:w="85" w:type="dxa"/>
+              <w:left w:w="85" w:type="dxa"/>
+              <w:bottom w:w="85" w:type="dxa"/>
+              <w:right w:w="85" w:type="dxa"/>
+            </w:tcMar>
+          </w:tcPr>
+          <w:p>
+            <w:pPr>
+              <w:spacing w:after="40"/>
+            </w:pPr>
+            <w:r>
+              <w:rPr>
+                <w:sz w:val="20"/>
+              </w:rPr>
+              <w:t>Explained but not configured; no owned domain was supplied</w:t>
             </w:r>
           </w:p>
         </w:tc>
@@ -1468,17 +1565,17 @@
         <w:pStyle w:val="FixedQuestion"/>
       </w:pPr>
       <w:r>
-        <w:t>Evidence required to complete public deployment</w:t>
+        <w:t>Public deployment evidence and custom-domain explanation</w:t>
       </w:r>
     </w:p>
     <w:p>
       <w:r>
-        <w:t>Record the Sepolia contract address, successful deployment transaction, at least one interaction transaction, and a genuine oracle request/callback if the live service is available. Then set the public frontend configuration to the verified Sepolia address, rebuild and publish the dist directory to IPFS. Record its actual root CID and test the resulting gateway URL. Publishing the frontend does not deploy the smart contract.</w:t>
+        <w:t>The Sepolia contract address is 0xCBa5edaAf9d6407A85531091C3762Ae6bfCF30c3. The deployment transaction is https://sepolia.etherscan.io/tx/0xeee0ecc55a8dd03507e96afe978fcf0f50c8be8f7b1a3a32f7871e67b1b0b000, and the successful bet transaction is https://sepolia.etherscan.io/tx/0xddbdda9cdbb081ced423dd02e8014acf18e541eafdedb528900ba9fcd4c7dc42. The public frontend uses the same verified address in config.json, and its root CID is bafybeicmwmi6imwpgtf63sbvpoeb7dqa7onrrxtldfmjkpx6orqzv62n5y. The gateway URL was tested from a separate browser session and loaded the application. Publishing the frontend does not deploy the smart contract.</w:t>
       </w:r>
     </w:p>
     <w:p>
       <w:r>
-        <w:t>Push the source and lockfile to the course’s existing GitHub repository, include the repository link, and grant the instructor and TA the requested access. A custom domain additionally requires control of its DNS and a DNSLink TXT record pointing to the published CID. Do not report a sample CID, a local address or the IPFS documentation URL as a completed deployment. [18]</w:t>
+        <w:t>A custom IPFS domain would require control of a domain and an HTTPS gateway configured to resolve DNSLink. The owner would publish a TXT record named _dnslink.example.org with the value dnslink=/ipfs/bafybeicmwmi6imwpgtf63sbvpoeb7dqa7onrrxtldfmjkpx6orqzv62n5y, then configure the gateway and verify the hostname. This report does not claim a custom domain because no domain was supplied. The 100-bet oracle callback is likewise not claimed; the one live bet is evidence of contract interaction only. [18]</w:t>
       </w:r>
     </w:p>
     <w:p>
@@ -1686,6 +1783,28 @@
           <w:sz w:val="19"/>
         </w:rPr>
         <w:t>[18] IPFS. Custom domains and DNSLink. https://docs.ipfs.tech/how-to/websites-on-ipfs/custom-domains/</w:t>
+      </w:r>
+    </w:p>
+    <w:p>
+      <w:pPr>
+        <w:spacing w:after="140"/>
+      </w:pPr>
+      <w:r>
+        <w:rPr>
+          <w:sz w:val="19"/>
+        </w:rPr>
+        <w:t>[19] Course submission repository. https://github.com/p8zvvckk5s-jpg/ethereum-course-assignments</w:t>
+      </w:r>
+    </w:p>
+    <w:p>
+      <w:pPr>
+        <w:spacing w:after="140"/>
+      </w:pPr>
+      <w:r>
+        <w:rPr>
+          <w:sz w:val="19"/>
+        </w:rPr>
+        <w:t>[20] Etherscan Sepolia contract and transaction explorer. https://sepolia.etherscan.io/</w:t>
       </w:r>
     </w:p>
     <w:p>

</xml_diff>